<commit_message>
Add ability to digitally sign documents with saved signatures
Implement a digital signature feature allowing users to draw and save signatures, which are then embedded into generated document files (PDF and DOCX). The system supports signing as either a buyer or seller, includes status indicators for partially or fully signed documents, and allows for the removal of existing signatures. This enhancement also updates the document list view and documentation to reflect the new functionality.

Replit-Commit-Author: Agent
Replit-Commit-Session-Id: 359075c4-f6cc-4727-990b-acbaafad0c22
Replit-Commit-Checkpoint-Type: full_checkpoint
Replit-Commit-Event-Id: 30cef284-6af5-460a-b8ec-0e74c4255eb0
Replit-Commit-Screenshot-Url: https://storage.googleapis.com/screenshot-production-us-central1/efc895ca-161b-43cb-8555-2a7825ee93b6/359075c4-f6cc-4727-990b-acbaafad0c22/RAljEDS
Replit-Helium-Checkpoint-Created: true
</commit_message>
<xml_diff>
--- a/generated_docs/f0b8c62b-e345-4a00-afdc-b922983317d6.docx
+++ b/generated_docs/f0b8c62b-e345-4a00-afdc-b922983317d6.docx
@@ -1843,6 +1843,237 @@
         <w:spacing w:after="60" w:before="60"/>
       </w:pPr>
     </w:p>
+    <w:p>
+      <w:pPr>
+        <w:spacing w:before="400"/>
+      </w:pPr>
+    </w:p>
+    <w:p>
+      <w:pPr>
+        <w:pBdr>
+          <w:bottom w:val="single" w:color="333333" w:sz="2"/>
+        </w:pBdr>
+        <w:spacing w:after="200"/>
+        <w:jc w:val="center"/>
+      </w:pPr>
+      <w:r>
+        <w:rPr>
+          <w:rFonts w:ascii="Calibri" w:cs="Calibri" w:eastAsia="Calibri" w:hAnsi="Calibri"/>
+          <w:b/>
+          <w:bCs/>
+          <w:sz w:val="22"/>
+          <w:szCs w:val="22"/>
+        </w:rPr>
+        <w:t xml:space="preserve">SIGNATURES</w:t>
+      </w:r>
+    </w:p>
+    <w:tbl>
+      <w:tblPr>
+        <w:tblW w:type="dxa" w:w="9000"/>
+        <w:tblBorders>
+          <w:top w:val="single" w:color="auto" w:sz="4"/>
+          <w:left w:val="single" w:color="auto" w:sz="4"/>
+          <w:bottom w:val="single" w:color="auto" w:sz="4"/>
+          <w:right w:val="single" w:color="auto" w:sz="4"/>
+          <w:insideH w:val="single" w:color="auto" w:sz="4"/>
+          <w:insideV w:val="single" w:color="auto" w:sz="4"/>
+        </w:tblBorders>
+      </w:tblPr>
+      <w:tblGrid>
+        <w:gridCol w:w="100"/>
+        <w:gridCol w:w="100"/>
+      </w:tblGrid>
+      <w:tr>
+        <w:tc>
+          <w:tcPr>
+            <w:tcW w:type="dxa" w:w="4500"/>
+            <w:tcBorders>
+              <w:top w:val="none"/>
+              <w:left w:val="none"/>
+              <w:bottom w:val="none"/>
+              <w:right w:val="none"/>
+            </w:tcBorders>
+          </w:tcPr>
+          <w:p>
+            <w:pPr>
+              <w:spacing w:after="100"/>
+            </w:pPr>
+            <w:r>
+              <w:rPr>
+                <w:rFonts w:ascii="Calibri" w:cs="Calibri" w:eastAsia="Calibri" w:hAnsi="Calibri"/>
+                <w:b/>
+                <w:bCs/>
+                <w:sz w:val="18"/>
+                <w:szCs w:val="18"/>
+              </w:rPr>
+              <w:t xml:space="preserve">FOR &amp; ON BEHALF OF SELLER</w:t>
+            </w:r>
+          </w:p>
+          <w:p>
+            <w:pPr>
+              <w:spacing w:after="60"/>
+            </w:pPr>
+            <w:r>
+              <w:drawing>
+                <wp:inline distT="0" distB="0" distL="0" distR="0">
+                  <wp:extent cx="1714500" cy="666750"/>
+                  <wp:effectExtent t="0" r="0" b="0" l="0"/>
+                  <wp:docPr id="1" name="" descr="" title=""/>
+                  <wp:cNvGraphicFramePr>
+                    <a:graphicFrameLocks xmlns:a="http://schemas.openxmlformats.org/drawingml/2006/main" noChangeAspect="1"/>
+                  </wp:cNvGraphicFramePr>
+                  <a:graphic xmlns:a="http://schemas.openxmlformats.org/drawingml/2006/main">
+                    <a:graphicData uri="http://schemas.openxmlformats.org/drawingml/2006/picture">
+                      <pic:pic xmlns:pic="http://schemas.openxmlformats.org/drawingml/2006/picture">
+                        <pic:nvPicPr>
+                          <pic:cNvPr id="0" name="" descr=""/>
+                          <pic:cNvPicPr>
+                            <a:picLocks noChangeAspect="1" noChangeArrowheads="1"/>
+                          </pic:cNvPicPr>
+                        </pic:nvPicPr>
+                        <pic:blipFill>
+                          <a:blip r:embed="rId7" cstate="none"/>
+                          <a:srcRect/>
+                          <a:stretch>
+                            <a:fillRect/>
+                          </a:stretch>
+                        </pic:blipFill>
+                        <pic:spPr bwMode="auto">
+                          <a:xfrm>
+                            <a:off x="0" y="0"/>
+                            <a:ext cx="1714500" cy="666750"/>
+                          </a:xfrm>
+                          <a:prstGeom prst="rect">
+                            <a:avLst/>
+                          </a:prstGeom>
+                        </pic:spPr>
+                      </pic:pic>
+                    </a:graphicData>
+                  </a:graphic>
+                </wp:inline>
+              </w:drawing>
+            </w:r>
+          </w:p>
+          <w:p>
+            <w:pPr>
+              <w:spacing w:after="40"/>
+            </w:pPr>
+            <w:r>
+              <w:rPr>
+                <w:rFonts w:ascii="Calibri" w:cs="Calibri" w:eastAsia="Calibri" w:hAnsi="Calibri"/>
+                <w:sz w:val="18"/>
+                <w:szCs w:val="18"/>
+              </w:rPr>
+              <w:t xml:space="preserve">Name: John Smith</w:t>
+            </w:r>
+          </w:p>
+          <w:p>
+            <w:r>
+              <w:rPr>
+                <w:rFonts w:ascii="Calibri" w:cs="Calibri" w:eastAsia="Calibri" w:hAnsi="Calibri"/>
+                <w:sz w:val="18"/>
+                <w:szCs w:val="18"/>
+              </w:rPr>
+              <w:t xml:space="preserve">Date: 09 Mar 2026</w:t>
+            </w:r>
+          </w:p>
+        </w:tc>
+        <w:tc>
+          <w:tcPr>
+            <w:tcW w:type="dxa" w:w="4500"/>
+            <w:tcBorders>
+              <w:top w:val="none"/>
+              <w:left w:val="none"/>
+              <w:bottom w:val="none"/>
+              <w:right w:val="none"/>
+            </w:tcBorders>
+          </w:tcPr>
+          <w:p>
+            <w:pPr>
+              <w:spacing w:after="100"/>
+            </w:pPr>
+            <w:r>
+              <w:rPr>
+                <w:rFonts w:ascii="Calibri" w:cs="Calibri" w:eastAsia="Calibri" w:hAnsi="Calibri"/>
+                <w:b/>
+                <w:bCs/>
+                <w:sz w:val="18"/>
+                <w:szCs w:val="18"/>
+              </w:rPr>
+              <w:t xml:space="preserve">FOR &amp; ON BEHALF OF BUYER</w:t>
+            </w:r>
+          </w:p>
+          <w:p>
+            <w:pPr>
+              <w:spacing w:after="60"/>
+            </w:pPr>
+            <w:r>
+              <w:drawing>
+                <wp:inline distT="0" distB="0" distL="0" distR="0">
+                  <wp:extent cx="1714500" cy="666750"/>
+                  <wp:effectExtent t="0" r="0" b="0" l="0"/>
+                  <wp:docPr id="1" name="" descr="" title=""/>
+                  <wp:cNvGraphicFramePr>
+                    <a:graphicFrameLocks xmlns:a="http://schemas.openxmlformats.org/drawingml/2006/main" noChangeAspect="1"/>
+                  </wp:cNvGraphicFramePr>
+                  <a:graphic xmlns:a="http://schemas.openxmlformats.org/drawingml/2006/main">
+                    <a:graphicData uri="http://schemas.openxmlformats.org/drawingml/2006/picture">
+                      <pic:pic xmlns:pic="http://schemas.openxmlformats.org/drawingml/2006/picture">
+                        <pic:nvPicPr>
+                          <pic:cNvPr id="0" name="" descr=""/>
+                          <pic:cNvPicPr>
+                            <a:picLocks noChangeAspect="1" noChangeArrowheads="1"/>
+                          </pic:cNvPicPr>
+                        </pic:nvPicPr>
+                        <pic:blipFill>
+                          <a:blip r:embed="rId8" cstate="none"/>
+                          <a:srcRect/>
+                          <a:stretch>
+                            <a:fillRect/>
+                          </a:stretch>
+                        </pic:blipFill>
+                        <pic:spPr bwMode="auto">
+                          <a:xfrm>
+                            <a:off x="0" y="0"/>
+                            <a:ext cx="1714500" cy="666750"/>
+                          </a:xfrm>
+                          <a:prstGeom prst="rect">
+                            <a:avLst/>
+                          </a:prstGeom>
+                        </pic:spPr>
+                      </pic:pic>
+                    </a:graphicData>
+                  </a:graphic>
+                </wp:inline>
+              </w:drawing>
+            </w:r>
+          </w:p>
+          <w:p>
+            <w:pPr>
+              <w:spacing w:after="40"/>
+            </w:pPr>
+            <w:r>
+              <w:rPr>
+                <w:rFonts w:ascii="Calibri" w:cs="Calibri" w:eastAsia="Calibri" w:hAnsi="Calibri"/>
+                <w:sz w:val="18"/>
+                <w:szCs w:val="18"/>
+              </w:rPr>
+              <w:t xml:space="preserve">Name: Jane Doe</w:t>
+            </w:r>
+          </w:p>
+          <w:p>
+            <w:r>
+              <w:rPr>
+                <w:rFonts w:ascii="Calibri" w:cs="Calibri" w:eastAsia="Calibri" w:hAnsi="Calibri"/>
+                <w:sz w:val="18"/>
+                <w:szCs w:val="18"/>
+              </w:rPr>
+              <w:t xml:space="preserve">Date: 09 Mar 2026</w:t>
+            </w:r>
+          </w:p>
+        </w:tc>
+      </w:tr>
+    </w:tbl>
     <w:sectPr>
       <w:pgSz w:w="11906" w:h="16838" w:orient="portrait"/>
       <w:pgMar w:top="1440" w:right="1440" w:bottom="1440" w:left="1440" w:header="708" w:footer="708" w:gutter="0"/>

</xml_diff>